<commit_message>
Added an additional question and improved Question worksheet - WE
</commit_message>
<xml_diff>
--- a/docs/Question_Worksheet.docx
+++ b/docs/Question_Worksheet.docx
@@ -2,6 +2,38 @@
 <file path=word/document.xml><?xml version="1.0" encoding="utf-8"?>
 <w:document xmlns:wpc="http://schemas.microsoft.com/office/word/2010/wordprocessingCanvas" xmlns:mo="http://schemas.microsoft.com/office/mac/office/2008/main" xmlns:mc="http://schemas.openxmlformats.org/markup-compatibility/2006" xmlns:mv="urn:schemas-microsoft-com:mac:vml" xmlns:o="urn:schemas-microsoft-com:office:office" xmlns:r="http://schemas.openxmlformats.org/officeDocument/2006/relationships" xmlns:m="http://schemas.openxmlformats.org/officeDocument/2006/math" xmlns:v="urn:schemas-microsoft-com:vml" xmlns:wp14="http://schemas.microsoft.com/office/word/2010/wordprocessingDrawing" xmlns:wp="http://schemas.openxmlformats.org/drawingml/2006/wordprocessingDrawing" xmlns:w10="urn:schemas-microsoft-com:office:word" xmlns:w="http://schemas.openxmlformats.org/wordprocessingml/2006/main" xmlns:w14="http://schemas.microsoft.com/office/word/2010/wordml" xmlns:wpg="http://schemas.microsoft.com/office/word/2010/wordprocessingGroup" xmlns:wpi="http://schemas.microsoft.com/office/word/2010/wordprocessingInk" xmlns:wne="http://schemas.microsoft.com/office/word/2006/wordml" xmlns:wps="http://schemas.microsoft.com/office/word/2010/wordprocessingShape" mc:Ignorable="w14 wp14">
   <w:body>
+    <w:tbl>
+      <w:tblPr>
+        <w:tblW w:type="auto" w:w="0"/>
+        <w:tblLayout w:type="fixed"/>
+        <w:tblLook w:firstColumn="1" w:firstRow="1" w:lastColumn="0" w:lastRow="0" w:noHBand="0" w:noVBand="1" w:val="04A0"/>
+      </w:tblPr>
+      <w:tblGrid>
+        <w:gridCol w:w="8640"/>
+      </w:tblGrid>
+      <w:tr>
+        <w:tc>
+          <w:tcPr>
+            <w:tcW w:type="dxa" w:w="8640"/>
+            <w:shd w:val="clear" w:color="auto" w:fill="C0392B"/>
+          </w:tcPr>
+          <w:p>
+            <w:pPr>
+              <w:jc w:val="center"/>
+            </w:pPr>
+            <w:r>
+              <w:rPr>
+                <w:b/>
+                <w:color w:val="FFFFFF"/>
+                <w:sz w:val="22"/>
+              </w:rPr>
+              <w:t>EXAMPLE — DO NOT FILL OUT.  Use page 2 (Question Worksheet) for new questions.</w:t>
+            </w:r>
+          </w:p>
+        </w:tc>
+      </w:tr>
+    </w:tbl>
+    <w:p/>
     <w:p>
       <w:pPr>
         <w:jc w:val="center"/>
@@ -25,7 +57,7 @@
           <w:color w:val="555555"/>
           <w:sz w:val="20"/>
         </w:rPr>
-        <w:t>Here's how a finished question looks. The next page is a blank you can print and fill in.</w:t>
+        <w:t>Here's how a finished question looks. The next page is the blank to print and fill in.</w:t>
       </w:r>
     </w:p>
     <w:p/>
@@ -165,9 +197,9 @@
           </w:tcPr>
           <w:p>
             <w:r>
-              <w:t>[A] The famous Mexican grey wolf is named what?</w:t>
+              <w:t>[B] The famous Mexican grey wolf is named what?</w:t>
               <w:br/>
-              <w:t>Anna ✅ (image: images/choice-anna.svg)  ·  Jack (image: images/choice-jack.svg)  ·  Beverly (image: images/choice-beverly.svg)</w:t>
+              <w:t>Anna *  ·  Jack  ·  Beverly</w:t>
             </w:r>
           </w:p>
         </w:tc>
@@ -221,7 +253,7 @@
             <w:r>
               <w:t>[B] What kind of animal is Anna, who helped revive her species?</w:t>
               <w:br/>
-              <w:t>Wolf ✅  ·  Fox  ·  Coyote</w:t>
+              <w:t>Wolf *  ·  Fox  ·  Coyote</w:t>
             </w:r>
           </w:p>
         </w:tc>
@@ -315,7 +347,7 @@
           <w:color w:val="555555"/>
           <w:sz w:val="18"/>
         </w:rPr>
-        <w:t>Format A = pick a picture (3 choices, mark correct with ✅)   ·   Format B = pick a word (3 choices, mark correct with ✅)   ·   Format C = type the answer</w:t>
+        <w:t>Format A = pick a picture (3 choices, mark correct with *)   ·   Format B = pick a word (3 choices, mark correct with *)   ·   Format C = type the answer</w:t>
       </w:r>
     </w:p>
     <w:p>
@@ -349,7 +381,16 @@
         <w:t>Print as many copies as you need — one per question.</w:t>
       </w:r>
     </w:p>
-    <w:p/>
+    <w:p>
+      <w:r>
+        <w:rPr>
+          <w:i/>
+          <w:color w:val="555555"/>
+          <w:sz w:val="18"/>
+        </w:rPr>
+        <w:t>Sections to choose from: Collections, World's Fair.</w:t>
+      </w:r>
+    </w:p>
     <w:tbl>
       <w:tblPr>
         <w:tblStyle w:val="LightGrid-Accent1"/>
@@ -754,7 +795,7 @@
           <w:color w:val="555555"/>
           <w:sz w:val="18"/>
         </w:rPr>
-        <w:t>Format A = pick a picture (3 choices, mark correct with ✅)   ·   Format B = pick a word (3 choices, mark correct with ✅)   ·   Format C = type the answer</w:t>
+        <w:t>Format A = pick a picture (3 choices, mark correct with *)   ·   Format B = pick a word (3 choices, mark correct with *)   ·   Format C = type the answer</w:t>
       </w:r>
     </w:p>
     <w:sectPr>

</xml_diff>